<commit_message>
Add courses and certifications section, enhance about page vibe bubble, and improve logo carousel styling
</commit_message>
<xml_diff>
--- a/assets/Client Stories/client-stories.docx
+++ b/assets/Client Stories/client-stories.docx
@@ -710,6 +710,45 @@
       </w:pPr>
       <w:r>
         <w:t>Workstream: Crown &amp; Anchor Society &amp; Captain’s Club Brand Loyalty Programs</w:t>
+      </w:r>
+    </w:p>
+    <w:p>
+      <w:pPr>
+        <w:rPr>
+          <w:rFonts w:ascii="Helvetica Neue" w:hAnsi="Helvetica Neue"/>
+          <w:color w:val="681DA8"/>
+          <w:sz w:val="21"/>
+          <w:szCs w:val="21"/>
+        </w:rPr>
+      </w:pPr>
+      <w:r>
+        <w:rPr>
+          <w:rFonts w:ascii="Helvetica Neue" w:hAnsi="Helvetica Neue"/>
+          <w:color w:val="681DA8"/>
+          <w:sz w:val="21"/>
+          <w:szCs w:val="21"/>
+        </w:rPr>
+        <w:t xml:space="preserve">Add </w:t>
+      </w:r>
+      <w:proofErr w:type="spellStart"/>
+      <w:r>
+        <w:rPr>
+          <w:rFonts w:ascii="Helvetica Neue" w:hAnsi="Helvetica Neue"/>
+          <w:color w:val="681DA8"/>
+          <w:sz w:val="21"/>
+          <w:szCs w:val="21"/>
+        </w:rPr>
+        <w:t>descriptins</w:t>
+      </w:r>
+      <w:proofErr w:type="spellEnd"/>
+      <w:r>
+        <w:rPr>
+          <w:rFonts w:ascii="Helvetica Neue" w:hAnsi="Helvetica Neue"/>
+          <w:color w:val="681DA8"/>
+          <w:sz w:val="21"/>
+          <w:szCs w:val="21"/>
+        </w:rPr>
+        <w:t xml:space="preserve"> from promo case</w:t>
       </w:r>
     </w:p>
     <w:p>

</xml_diff>